<commit_message>
feat: refine schedule workflow and refresh PO docs
</commit_message>
<xml_diff>
--- a/docs/PO_work/PO_Kanban_Board_Sprint2.docx
+++ b/docs/PO_work/PO_Kanban_Board_Sprint2.docx
@@ -4,42 +4,41 @@
   <w:body>
     <w:p>
       <w:pPr>
-        <w:pStyle w:val="Title"/>
         <w:jc w:val="center"/>
       </w:pPr>
       <w:r>
         <w:rPr>
           <w:b/>
+          <w:sz w:val="36"/>
         </w:rPr>
         <w:t>PO Kanban Board Sprint 2</w:t>
       </w:r>
     </w:p>
     <w:p>
-      <w:pPr>
-        <w:jc w:val="center"/>
-      </w:pPr>
       <w:r>
-        <w:t>Expanded board with active In Progress work and broader sprint coverage.</w:t>
+        <w:t>Updated on March 25, 2026 to reflect the current Sprint 2 state after discussion, planning, import, and persistence work across the team.</w:t>
       </w:r>
     </w:p>
     <w:p>
-      <w:pPr>
-        <w:pStyle w:val="Heading1"/>
-      </w:pPr>
       <w:r>
+        <w:rPr>
+          <w:b/>
+          <w:sz w:val="24"/>
+        </w:rPr>
         <w:t>Board Rule</w:t>
       </w:r>
     </w:p>
     <w:p>
       <w:r>
-        <w:t>This board is maintained from the Product Owner perspective to keep Sprint 2 focused on real delivery status. Items in In Progress should represent work that is actively moving, not ideas that have not started yet.</w:t>
+        <w:t>This board is maintained from the Product Owner perspective to keep Sprint 2 aligned with actual delivery status. Items in In Progress represent work that is actively moving and still needs coordination, not already-finished tasks.</w:t>
       </w:r>
     </w:p>
     <w:p>
-      <w:pPr>
-        <w:pStyle w:val="Heading1"/>
-      </w:pPr>
       <w:r>
+        <w:rPr>
+          <w:b/>
+          <w:sz w:val="24"/>
+        </w:rPr>
         <w:t>Sprint 2 Kanban</w:t>
       </w:r>
     </w:p>
@@ -50,15 +49,15 @@
         <w:tblLook w:firstColumn="1" w:firstRow="1" w:lastColumn="0" w:lastRow="0" w:noHBand="0" w:noVBand="1" w:val="04A0"/>
       </w:tblPr>
       <w:tblGrid>
-        <w:gridCol w:w="3600"/>
-        <w:gridCol w:w="3600"/>
-        <w:gridCol w:w="3600"/>
-        <w:gridCol w:w="3600"/>
+        <w:gridCol w:w="2556"/>
+        <w:gridCol w:w="2556"/>
+        <w:gridCol w:w="2556"/>
+        <w:gridCol w:w="2556"/>
       </w:tblGrid>
       <w:tr>
         <w:tc>
           <w:tcPr>
-            <w:tcW w:type="dxa" w:w="3600"/>
+            <w:tcW w:type="dxa" w:w="2556"/>
           </w:tcPr>
           <w:p>
             <w:r>
@@ -68,7 +67,7 @@
         </w:tc>
         <w:tc>
           <w:tcPr>
-            <w:tcW w:type="dxa" w:w="3600"/>
+            <w:tcW w:type="dxa" w:w="2556"/>
           </w:tcPr>
           <w:p>
             <w:r>
@@ -78,7 +77,7 @@
         </w:tc>
         <w:tc>
           <w:tcPr>
-            <w:tcW w:type="dxa" w:w="3600"/>
+            <w:tcW w:type="dxa" w:w="2556"/>
           </w:tcPr>
           <w:p>
             <w:r>
@@ -88,7 +87,7 @@
         </w:tc>
         <w:tc>
           <w:tcPr>
-            <w:tcW w:type="dxa" w:w="3600"/>
+            <w:tcW w:type="dxa" w:w="2556"/>
           </w:tcPr>
           <w:p>
             <w:r>
@@ -100,7 +99,7 @@
       <w:tr>
         <w:tc>
           <w:tcPr>
-            <w:tcW w:type="dxa" w:w="3600"/>
+            <w:tcW w:type="dxa" w:w="2556"/>
           </w:tcPr>
           <w:p>
             <w:r>
@@ -110,31 +109,31 @@
         </w:tc>
         <w:tc>
           <w:tcPr>
-            <w:tcW w:type="dxa" w:w="3600"/>
+            <w:tcW w:type="dxa" w:w="2556"/>
           </w:tcPr>
           <w:p>
             <w:r>
-              <w:t>Cross-module reusable comment section</w:t>
+              <w:t>Schedule reminders and notification logic</w:t>
             </w:r>
           </w:p>
         </w:tc>
         <w:tc>
           <w:tcPr>
-            <w:tcW w:type="dxa" w:w="3600"/>
+            <w:tcW w:type="dxa" w:w="2556"/>
           </w:tcPr>
           <w:p>
             <w:r>
-              <w:t>Schedule / all modules</w:t>
+              <w:t>Schedule</w:t>
             </w:r>
           </w:p>
         </w:tc>
         <w:tc>
           <w:tcPr>
-            <w:tcW w:type="dxa" w:w="3600"/>
+            <w:tcW w:type="dxa" w:w="2556"/>
           </w:tcPr>
           <w:p>
             <w:r>
-              <w:t>Keep as reusable design work only after core sprint closure.</w:t>
+              <w:t>Keep behind current planning and persistence stabilization.</w:t>
             </w:r>
           </w:p>
         </w:tc>
@@ -142,7 +141,7 @@
       <w:tr>
         <w:tc>
           <w:tcPr>
-            <w:tcW w:type="dxa" w:w="3600"/>
+            <w:tcW w:type="dxa" w:w="2556"/>
           </w:tcPr>
           <w:p>
             <w:r>
@@ -152,17 +151,983 @@
         </w:tc>
         <w:tc>
           <w:tcPr>
-            <w:tcW w:type="dxa" w:w="3600"/>
+            <w:tcW w:type="dxa" w:w="2556"/>
           </w:tcPr>
           <w:p>
             <w:r>
-              <w:t>Forum moderation / report handling</w:t>
+              <w:t>Calendar export and external sync</w:t>
             </w:r>
           </w:p>
         </w:tc>
         <w:tc>
           <w:tcPr>
-            <w:tcW w:type="dxa" w:w="3600"/>
+            <w:tcW w:type="dxa" w:w="2556"/>
+          </w:tcPr>
+          <w:p>
+            <w:r>
+              <w:t>Schedule</w:t>
+            </w:r>
+          </w:p>
+        </w:tc>
+        <w:tc>
+          <w:tcPr>
+            <w:tcW w:type="dxa" w:w="2556"/>
+          </w:tcPr>
+          <w:p>
+            <w:r>
+              <w:t>Useful later, but not needed to close Sprint 2.</w:t>
+            </w:r>
+          </w:p>
+        </w:tc>
+      </w:tr>
+      <w:tr>
+        <w:tc>
+          <w:tcPr>
+            <w:tcW w:type="dxa" w:w="2556"/>
+          </w:tcPr>
+          <w:p>
+            <w:r>
+              <w:t>Backlog</w:t>
+            </w:r>
+          </w:p>
+        </w:tc>
+        <w:tc>
+          <w:tcPr>
+            <w:tcW w:type="dxa" w:w="2556"/>
+          </w:tcPr>
+          <w:p>
+            <w:r>
+              <w:t>Discussion moderation and report handling</w:t>
+            </w:r>
+          </w:p>
+        </w:tc>
+        <w:tc>
+          <w:tcPr>
+            <w:tcW w:type="dxa" w:w="2556"/>
+          </w:tcPr>
+          <w:p>
+            <w:r>
+              <w:t>Forum and comments</w:t>
+            </w:r>
+          </w:p>
+        </w:tc>
+        <w:tc>
+          <w:tcPr>
+            <w:tcW w:type="dxa" w:w="2556"/>
+          </w:tcPr>
+          <w:p>
+            <w:r>
+              <w:t>Delay until the main discussion path and data model are stable.</w:t>
+            </w:r>
+          </w:p>
+        </w:tc>
+      </w:tr>
+      <w:tr>
+        <w:tc>
+          <w:tcPr>
+            <w:tcW w:type="dxa" w:w="2556"/>
+          </w:tcPr>
+          <w:p>
+            <w:r>
+              <w:t>Backlog</w:t>
+            </w:r>
+          </w:p>
+        </w:tc>
+        <w:tc>
+          <w:tcPr>
+            <w:tcW w:type="dxa" w:w="2556"/>
+          </w:tcPr>
+          <w:p>
+            <w:r>
+              <w:t>Expanded analytics and study insight panels</w:t>
+            </w:r>
+          </w:p>
+        </w:tc>
+        <w:tc>
+          <w:tcPr>
+            <w:tcW w:type="dxa" w:w="2556"/>
+          </w:tcPr>
+          <w:p>
+            <w:r>
+              <w:t>Dashboard / progress</w:t>
+            </w:r>
+          </w:p>
+        </w:tc>
+        <w:tc>
+          <w:tcPr>
+            <w:tcW w:type="dxa" w:w="2556"/>
+          </w:tcPr>
+          <w:p>
+            <w:r>
+              <w:t>Secondary to schedule, comments, and core learning reliability.</w:t>
+            </w:r>
+          </w:p>
+        </w:tc>
+      </w:tr>
+      <w:tr>
+        <w:tc>
+          <w:tcPr>
+            <w:tcW w:type="dxa" w:w="2556"/>
+          </w:tcPr>
+          <w:p>
+            <w:r>
+              <w:t>Backlog</w:t>
+            </w:r>
+          </w:p>
+        </w:tc>
+        <w:tc>
+          <w:tcPr>
+            <w:tcW w:type="dxa" w:w="2556"/>
+          </w:tcPr>
+          <w:p>
+            <w:r>
+              <w:t>Admin content upload and material operations tools</w:t>
+            </w:r>
+          </w:p>
+        </w:tc>
+        <w:tc>
+          <w:tcPr>
+            <w:tcW w:type="dxa" w:w="2556"/>
+          </w:tcPr>
+          <w:p>
+            <w:r>
+              <w:t>Content operations</w:t>
+            </w:r>
+          </w:p>
+        </w:tc>
+        <w:tc>
+          <w:tcPr>
+            <w:tcW w:type="dxa" w:w="2556"/>
+          </w:tcPr>
+          <w:p>
+            <w:r>
+              <w:t>Can follow after the core student flow is secured.</w:t>
+            </w:r>
+          </w:p>
+        </w:tc>
+      </w:tr>
+      <w:tr>
+        <w:tc>
+          <w:tcPr>
+            <w:tcW w:type="dxa" w:w="2556"/>
+          </w:tcPr>
+          <w:p>
+            <w:r>
+              <w:t>To Do</w:t>
+            </w:r>
+          </w:p>
+        </w:tc>
+        <w:tc>
+          <w:tcPr>
+            <w:tcW w:type="dxa" w:w="2556"/>
+          </w:tcPr>
+          <w:p>
+            <w:r>
+              <w:t>Review Center direct navigation entry</w:t>
+            </w:r>
+          </w:p>
+        </w:tc>
+        <w:tc>
+          <w:tcPr>
+            <w:tcW w:type="dxa" w:w="2556"/>
+          </w:tcPr>
+          <w:p>
+            <w:r>
+              <w:t>Review / navigation</w:t>
+            </w:r>
+          </w:p>
+        </w:tc>
+        <w:tc>
+          <w:tcPr>
+            <w:tcW w:type="dxa" w:w="2556"/>
+          </w:tcPr>
+          <w:p>
+            <w:r>
+              <w:t>Still needed because review exists but is not prominent enough.</w:t>
+            </w:r>
+          </w:p>
+        </w:tc>
+      </w:tr>
+      <w:tr>
+        <w:tc>
+          <w:tcPr>
+            <w:tcW w:type="dxa" w:w="2556"/>
+          </w:tcPr>
+          <w:p>
+            <w:r>
+              <w:t>To Do</w:t>
+            </w:r>
+          </w:p>
+        </w:tc>
+        <w:tc>
+          <w:tcPr>
+            <w:tcW w:type="dxa" w:w="2556"/>
+          </w:tcPr>
+          <w:p>
+            <w:r>
+              <w:t>Discussion plaza persistence unification</w:t>
+            </w:r>
+          </w:p>
+        </w:tc>
+        <w:tc>
+          <w:tcPr>
+            <w:tcW w:type="dxa" w:w="2556"/>
+          </w:tcPr>
+          <w:p>
+            <w:r>
+              <w:t>Forum / database</w:t>
+            </w:r>
+          </w:p>
+        </w:tc>
+        <w:tc>
+          <w:tcPr>
+            <w:tcW w:type="dxa" w:w="2556"/>
+          </w:tcPr>
+          <w:p>
+            <w:r>
+              <w:t>Module comments now persist; the wider plaza still needs one durable storage strategy.</w:t>
+            </w:r>
+          </w:p>
+        </w:tc>
+      </w:tr>
+      <w:tr>
+        <w:tc>
+          <w:tcPr>
+            <w:tcW w:type="dxa" w:w="2556"/>
+          </w:tcPr>
+          <w:p>
+            <w:r>
+              <w:t>To Do</w:t>
+            </w:r>
+          </w:p>
+        </w:tc>
+        <w:tc>
+          <w:tcPr>
+            <w:tcW w:type="dxa" w:w="2556"/>
+          </w:tcPr>
+          <w:p>
+            <w:r>
+              <w:t>Final bilingual copy cleanup for schedule, comments, dashboard, and home</w:t>
+            </w:r>
+          </w:p>
+        </w:tc>
+        <w:tc>
+          <w:tcPr>
+            <w:tcW w:type="dxa" w:w="2556"/>
+          </w:tcPr>
+          <w:p>
+            <w:r>
+              <w:t>Shared UX</w:t>
+            </w:r>
+          </w:p>
+        </w:tc>
+        <w:tc>
+          <w:tcPr>
+            <w:tcW w:type="dxa" w:w="2556"/>
+          </w:tcPr>
+          <w:p>
+            <w:r>
+              <w:t>Important for clarity after large functional growth.</w:t>
+            </w:r>
+          </w:p>
+        </w:tc>
+      </w:tr>
+      <w:tr>
+        <w:tc>
+          <w:tcPr>
+            <w:tcW w:type="dxa" w:w="2556"/>
+          </w:tcPr>
+          <w:p>
+            <w:r>
+              <w:t>To Do</w:t>
+            </w:r>
+          </w:p>
+        </w:tc>
+        <w:tc>
+          <w:tcPr>
+            <w:tcW w:type="dxa" w:w="2556"/>
+          </w:tcPr>
+          <w:p>
+            <w:r>
+              <w:t>Smaller-screen polish for timetable and context comments</w:t>
+            </w:r>
+          </w:p>
+        </w:tc>
+        <w:tc>
+          <w:tcPr>
+            <w:tcW w:type="dxa" w:w="2556"/>
+          </w:tcPr>
+          <w:p>
+            <w:r>
+              <w:t>Shared UI</w:t>
+            </w:r>
+          </w:p>
+        </w:tc>
+        <w:tc>
+          <w:tcPr>
+            <w:tcW w:type="dxa" w:w="2556"/>
+          </w:tcPr>
+          <w:p>
+            <w:r>
+              <w:t>Keep mobile readability under control before sprint closure.</w:t>
+            </w:r>
+          </w:p>
+        </w:tc>
+      </w:tr>
+      <w:tr>
+        <w:tc>
+          <w:tcPr>
+            <w:tcW w:type="dxa" w:w="2556"/>
+          </w:tcPr>
+          <w:p>
+            <w:r>
+              <w:t>To Do</w:t>
+            </w:r>
+          </w:p>
+        </w:tc>
+        <w:tc>
+          <w:tcPr>
+            <w:tcW w:type="dxa" w:w="2556"/>
+          </w:tcPr>
+          <w:p>
+            <w:r>
+              <w:t>Cross-device validation after migration rollout</w:t>
+            </w:r>
+          </w:p>
+        </w:tc>
+        <w:tc>
+          <w:tcPr>
+            <w:tcW w:type="dxa" w:w="2556"/>
+          </w:tcPr>
+          <w:p>
+            <w:r>
+              <w:t>QA / data</w:t>
+            </w:r>
+          </w:p>
+        </w:tc>
+        <w:tc>
+          <w:tcPr>
+            <w:tcW w:type="dxa" w:w="2556"/>
+          </w:tcPr>
+          <w:p>
+            <w:r>
+              <w:t>Need to confirm the same account sees the same data path reliably.</w:t>
+            </w:r>
+          </w:p>
+        </w:tc>
+      </w:tr>
+      <w:tr>
+        <w:tc>
+          <w:tcPr>
+            <w:tcW w:type="dxa" w:w="2556"/>
+          </w:tcPr>
+          <w:p>
+            <w:r>
+              <w:t>In Progress</w:t>
+            </w:r>
+          </w:p>
+        </w:tc>
+        <w:tc>
+          <w:tcPr>
+            <w:tcW w:type="dxa" w:w="2556"/>
+          </w:tcPr>
+          <w:p>
+            <w:r>
+              <w:t>Supabase migration rollout for schedule profiles and context comments</w:t>
+            </w:r>
+          </w:p>
+        </w:tc>
+        <w:tc>
+          <w:tcPr>
+            <w:tcW w:type="dxa" w:w="2556"/>
+          </w:tcPr>
+          <w:p>
+            <w:r>
+              <w:t>Database</w:t>
+            </w:r>
+          </w:p>
+        </w:tc>
+        <w:tc>
+          <w:tcPr>
+            <w:tcW w:type="dxa" w:w="2556"/>
+          </w:tcPr>
+          <w:p>
+            <w:r>
+              <w:t>Schema and API path are ready; environment application and verification remain active.</w:t>
+            </w:r>
+          </w:p>
+        </w:tc>
+      </w:tr>
+      <w:tr>
+        <w:tc>
+          <w:tcPr>
+            <w:tcW w:type="dxa" w:w="2556"/>
+          </w:tcPr>
+          <w:p>
+            <w:r>
+              <w:t>In Progress</w:t>
+            </w:r>
+          </w:p>
+        </w:tc>
+        <w:tc>
+          <w:tcPr>
+            <w:tcW w:type="dxa" w:w="2556"/>
+          </w:tcPr>
+          <w:p>
+            <w:r>
+              <w:t>Schedule builder preview to apply to manual-edit verification</w:t>
+            </w:r>
+          </w:p>
+        </w:tc>
+        <w:tc>
+          <w:tcPr>
+            <w:tcW w:type="dxa" w:w="2556"/>
+          </w:tcPr>
+          <w:p>
+            <w:r>
+              <w:t>Schedule / API</w:t>
+            </w:r>
+          </w:p>
+        </w:tc>
+        <w:tc>
+          <w:tcPr>
+            <w:tcW w:type="dxa" w:w="2556"/>
+          </w:tcPr>
+          <w:p>
+            <w:r>
+              <w:t>Confirm the new planning flow behaves consistently with timetable and deadlines.</w:t>
+            </w:r>
+          </w:p>
+        </w:tc>
+      </w:tr>
+      <w:tr>
+        <w:tc>
+          <w:tcPr>
+            <w:tcW w:type="dxa" w:w="2556"/>
+          </w:tcPr>
+          <w:p>
+            <w:r>
+              <w:t>In Progress</w:t>
+            </w:r>
+          </w:p>
+        </w:tc>
+        <w:tc>
+          <w:tcPr>
+            <w:tcW w:type="dxa" w:w="2556"/>
+          </w:tcPr>
+          <w:p>
+            <w:r>
+              <w:t>Context comment consistency across Listening, Speaking, Reading, and Writing</w:t>
+            </w:r>
+          </w:p>
+        </w:tc>
+        <w:tc>
+          <w:tcPr>
+            <w:tcW w:type="dxa" w:w="2556"/>
+          </w:tcPr>
+          <w:p>
+            <w:r>
+              <w:t>Comments</w:t>
+            </w:r>
+          </w:p>
+        </w:tc>
+        <w:tc>
+          <w:tcPr>
+            <w:tcW w:type="dxa" w:w="2556"/>
+          </w:tcPr>
+          <w:p>
+            <w:r>
+              <w:t>The reusable dock is in place; now the shared behavior needs tighter validation.</w:t>
+            </w:r>
+          </w:p>
+        </w:tc>
+      </w:tr>
+      <w:tr>
+        <w:tc>
+          <w:tcPr>
+            <w:tcW w:type="dxa" w:w="2556"/>
+          </w:tcPr>
+          <w:p>
+            <w:r>
+              <w:t>In Progress</w:t>
+            </w:r>
+          </w:p>
+        </w:tc>
+        <w:tc>
+          <w:tcPr>
+            <w:tcW w:type="dxa" w:w="2556"/>
+          </w:tcPr>
+          <w:p>
+            <w:r>
+              <w:t>Home, schedule, review, and dashboard connection refinement</w:t>
+            </w:r>
+          </w:p>
+        </w:tc>
+        <w:tc>
+          <w:tcPr>
+            <w:tcW w:type="dxa" w:w="2556"/>
+          </w:tcPr>
+          <w:p>
+            <w:r>
+              <w:t>Planning / navigation</w:t>
+            </w:r>
+          </w:p>
+        </w:tc>
+        <w:tc>
+          <w:tcPr>
+            <w:tcW w:type="dxa" w:w="2556"/>
+          </w:tcPr>
+          <w:p>
+            <w:r>
+              <w:t>The product now needs cleaner entry points across its core study flow.</w:t>
+            </w:r>
+          </w:p>
+        </w:tc>
+      </w:tr>
+      <w:tr>
+        <w:tc>
+          <w:tcPr>
+            <w:tcW w:type="dxa" w:w="2556"/>
+          </w:tcPr>
+          <w:p>
+            <w:r>
+              <w:t>In Progress</w:t>
+            </w:r>
+          </w:p>
+        </w:tc>
+        <w:tc>
+          <w:tcPr>
+            <w:tcW w:type="dxa" w:w="2556"/>
+          </w:tcPr>
+          <w:p>
+            <w:r>
+              <w:t>End-to-end sprint demo smoke test after planning and comment persistence work</w:t>
+            </w:r>
+          </w:p>
+        </w:tc>
+        <w:tc>
+          <w:tcPr>
+            <w:tcW w:type="dxa" w:w="2556"/>
+          </w:tcPr>
+          <w:p>
+            <w:r>
+              <w:t>Cross-page QA</w:t>
+            </w:r>
+          </w:p>
+        </w:tc>
+        <w:tc>
+          <w:tcPr>
+            <w:tcW w:type="dxa" w:w="2556"/>
+          </w:tcPr>
+          <w:p>
+            <w:r>
+              <w:t>Protect the demo path after multiple integrations landed.</w:t>
+            </w:r>
+          </w:p>
+        </w:tc>
+      </w:tr>
+      <w:tr>
+        <w:tc>
+          <w:tcPr>
+            <w:tcW w:type="dxa" w:w="2556"/>
+          </w:tcPr>
+          <w:p>
+            <w:r>
+              <w:t>In Progress</w:t>
+            </w:r>
+          </w:p>
+        </w:tc>
+        <w:tc>
+          <w:tcPr>
+            <w:tcW w:type="dxa" w:w="2556"/>
+          </w:tcPr>
+          <w:p>
+            <w:r>
+              <w:t>Listening, Speaking, Reading, and Writing regression pass after discussion integration</w:t>
+            </w:r>
+          </w:p>
+        </w:tc>
+        <w:tc>
+          <w:tcPr>
+            <w:tcW w:type="dxa" w:w="2556"/>
+          </w:tcPr>
+          <w:p>
+            <w:r>
+              <w:t>Core modules</w:t>
+            </w:r>
+          </w:p>
+        </w:tc>
+        <w:tc>
+          <w:tcPr>
+            <w:tcW w:type="dxa" w:w="2556"/>
+          </w:tcPr>
+          <w:p>
+            <w:r>
+              <w:t>Keep the new comment layer from weakening the main completion flow.</w:t>
+            </w:r>
+          </w:p>
+        </w:tc>
+      </w:tr>
+      <w:tr>
+        <w:tc>
+          <w:tcPr>
+            <w:tcW w:type="dxa" w:w="2556"/>
+          </w:tcPr>
+          <w:p>
+            <w:r>
+              <w:t>Review / Testing</w:t>
+            </w:r>
+          </w:p>
+        </w:tc>
+        <w:tc>
+          <w:tcPr>
+            <w:tcW w:type="dxa" w:w="2556"/>
+          </w:tcPr>
+          <w:p>
+            <w:r>
+              <w:t>Timetable screenshot and Excel import regression using real student files</w:t>
+            </w:r>
+          </w:p>
+        </w:tc>
+        <w:tc>
+          <w:tcPr>
+            <w:tcW w:type="dxa" w:w="2556"/>
+          </w:tcPr>
+          <w:p>
+            <w:r>
+              <w:t>Schedule</w:t>
+            </w:r>
+          </w:p>
+        </w:tc>
+        <w:tc>
+          <w:tcPr>
+            <w:tcW w:type="dxa" w:w="2556"/>
+          </w:tcPr>
+          <w:p>
+            <w:r>
+              <w:t>Verify the setup path remains practical with real timetable sources.</w:t>
+            </w:r>
+          </w:p>
+        </w:tc>
+      </w:tr>
+      <w:tr>
+        <w:tc>
+          <w:tcPr>
+            <w:tcW w:type="dxa" w:w="2556"/>
+          </w:tcPr>
+          <w:p>
+            <w:r>
+              <w:t>Review / Testing</w:t>
+            </w:r>
+          </w:p>
+        </w:tc>
+        <w:tc>
+          <w:tcPr>
+            <w:tcW w:type="dxa" w:w="2556"/>
+          </w:tcPr>
+          <w:p>
+            <w:r>
+              <w:t>Schedule generation by class periods, deadlines, and after-class slot QA</w:t>
+            </w:r>
+          </w:p>
+        </w:tc>
+        <w:tc>
+          <w:tcPr>
+            <w:tcW w:type="dxa" w:w="2556"/>
+          </w:tcPr>
+          <w:p>
+            <w:r>
+              <w:t>Schedule</w:t>
+            </w:r>
+          </w:p>
+        </w:tc>
+        <w:tc>
+          <w:tcPr>
+            <w:tcW w:type="dxa" w:w="2556"/>
+          </w:tcPr>
+          <w:p>
+            <w:r>
+              <w:t>Check that generated labels and task placement stay realistic.</w:t>
+            </w:r>
+          </w:p>
+        </w:tc>
+      </w:tr>
+      <w:tr>
+        <w:tc>
+          <w:tcPr>
+            <w:tcW w:type="dxa" w:w="2556"/>
+          </w:tcPr>
+          <w:p>
+            <w:r>
+              <w:t>Review / Testing</w:t>
+            </w:r>
+          </w:p>
+        </w:tc>
+        <w:tc>
+          <w:tcPr>
+            <w:tcW w:type="dxa" w:w="2556"/>
+          </w:tcPr>
+          <w:p>
+            <w:r>
+              <w:t>Homepage and schedule applied-plan consistency check</w:t>
+            </w:r>
+          </w:p>
+        </w:tc>
+        <w:tc>
+          <w:tcPr>
+            <w:tcW w:type="dxa" w:w="2556"/>
+          </w:tcPr>
+          <w:p>
+            <w:r>
+              <w:t>Home / schedule</w:t>
+            </w:r>
+          </w:p>
+        </w:tc>
+        <w:tc>
+          <w:tcPr>
+            <w:tcW w:type="dxa" w:w="2556"/>
+          </w:tcPr>
+          <w:p>
+            <w:r>
+              <w:t>Ensure the homepage reflects only the actually applied weekly arrangement.</w:t>
+            </w:r>
+          </w:p>
+        </w:tc>
+      </w:tr>
+      <w:tr>
+        <w:tc>
+          <w:tcPr>
+            <w:tcW w:type="dxa" w:w="2556"/>
+          </w:tcPr>
+          <w:p>
+            <w:r>
+              <w:t>Review / Testing</w:t>
+            </w:r>
+          </w:p>
+        </w:tc>
+        <w:tc>
+          <w:tcPr>
+            <w:tcW w:type="dxa" w:w="2556"/>
+          </w:tcPr>
+          <w:p>
+            <w:r>
+              <w:t>Context comment create, like, and share-to-plaza regression test</w:t>
+            </w:r>
+          </w:p>
+        </w:tc>
+        <w:tc>
+          <w:tcPr>
+            <w:tcW w:type="dxa" w:w="2556"/>
+          </w:tcPr>
+          <w:p>
+            <w:r>
+              <w:t>Comments / discussion</w:t>
+            </w:r>
+          </w:p>
+        </w:tc>
+        <w:tc>
+          <w:tcPr>
+            <w:tcW w:type="dxa" w:w="2556"/>
+          </w:tcPr>
+          <w:p>
+            <w:r>
+              <w:t>Keep the module discussion flow stable while database persistence is added.</w:t>
+            </w:r>
+          </w:p>
+        </w:tc>
+      </w:tr>
+      <w:tr>
+        <w:tc>
+          <w:tcPr>
+            <w:tcW w:type="dxa" w:w="2556"/>
+          </w:tcPr>
+          <w:p>
+            <w:r>
+              <w:t>Review / Testing</w:t>
+            </w:r>
+          </w:p>
+        </w:tc>
+        <w:tc>
+          <w:tcPr>
+            <w:tcW w:type="dxa" w:w="2556"/>
+          </w:tcPr>
+          <w:p>
+            <w:r>
+              <w:t>Reading and writing completion flow plus review-deck linkage QA</w:t>
+            </w:r>
+          </w:p>
+        </w:tc>
+        <w:tc>
+          <w:tcPr>
+            <w:tcW w:type="dxa" w:w="2556"/>
+          </w:tcPr>
+          <w:p>
+            <w:r>
+              <w:t>Reading / writing</w:t>
+            </w:r>
+          </w:p>
+        </w:tc>
+        <w:tc>
+          <w:tcPr>
+            <w:tcW w:type="dxa" w:w="2556"/>
+          </w:tcPr>
+          <w:p>
+            <w:r>
+              <w:t>Protect the academic practice path after recent integration work.</w:t>
+            </w:r>
+          </w:p>
+        </w:tc>
+      </w:tr>
+      <w:tr>
+        <w:tc>
+          <w:tcPr>
+            <w:tcW w:type="dxa" w:w="2556"/>
+          </w:tcPr>
+          <w:p>
+            <w:r>
+              <w:t>Review / Testing</w:t>
+            </w:r>
+          </w:p>
+        </w:tc>
+        <w:tc>
+          <w:tcPr>
+            <w:tcW w:type="dxa" w:w="2556"/>
+          </w:tcPr>
+          <w:p>
+            <w:r>
+              <w:t>Listening and speaking AI fallback plus feedback regression</w:t>
+            </w:r>
+          </w:p>
+        </w:tc>
+        <w:tc>
+          <w:tcPr>
+            <w:tcW w:type="dxa" w:w="2556"/>
+          </w:tcPr>
+          <w:p>
+            <w:r>
+              <w:t>Listening / speaking</w:t>
+            </w:r>
+          </w:p>
+        </w:tc>
+        <w:tc>
+          <w:tcPr>
+            <w:tcW w:type="dxa" w:w="2556"/>
+          </w:tcPr>
+          <w:p>
+            <w:r>
+              <w:t>Keep main-path feedback readable even when service conditions vary.</w:t>
+            </w:r>
+          </w:p>
+        </w:tc>
+      </w:tr>
+      <w:tr>
+        <w:tc>
+          <w:tcPr>
+            <w:tcW w:type="dxa" w:w="2556"/>
+          </w:tcPr>
+          <w:p>
+            <w:r>
+              <w:t>Done</w:t>
+            </w:r>
+          </w:p>
+        </w:tc>
+        <w:tc>
+          <w:tcPr>
+            <w:tcW w:type="dxa" w:w="2556"/>
+          </w:tcPr>
+          <w:p>
+            <w:r>
+              <w:t>DIICSU homepage branding and guided home entry</w:t>
+            </w:r>
+          </w:p>
+        </w:tc>
+        <w:tc>
+          <w:tcPr>
+            <w:tcW w:type="dxa" w:w="2556"/>
+          </w:tcPr>
+          <w:p>
+            <w:r>
+              <w:t>Home</w:t>
+            </w:r>
+          </w:p>
+        </w:tc>
+        <w:tc>
+          <w:tcPr>
+            <w:tcW w:type="dxa" w:w="2556"/>
+          </w:tcPr>
+          <w:p>
+            <w:r>
+              <w:t>Landing experience is now aligned with the target student group.</w:t>
+            </w:r>
+          </w:p>
+        </w:tc>
+      </w:tr>
+      <w:tr>
+        <w:tc>
+          <w:tcPr>
+            <w:tcW w:type="dxa" w:w="2556"/>
+          </w:tcPr>
+          <w:p>
+            <w:r>
+              <w:t>Done</w:t>
+            </w:r>
+          </w:p>
+        </w:tc>
+        <w:tc>
+          <w:tcPr>
+            <w:tcW w:type="dxa" w:w="2556"/>
+          </w:tcPr>
+          <w:p>
+            <w:r>
+              <w:t>Dashboard overview and learning tracker</w:t>
+            </w:r>
+          </w:p>
+        </w:tc>
+        <w:tc>
+          <w:tcPr>
+            <w:tcW w:type="dxa" w:w="2556"/>
+          </w:tcPr>
+          <w:p>
+            <w:r>
+              <w:t>Dashboard</w:t>
+            </w:r>
+          </w:p>
+        </w:tc>
+        <w:tc>
+          <w:tcPr>
+            <w:tcW w:type="dxa" w:w="2556"/>
+          </w:tcPr>
+          <w:p>
+            <w:r>
+              <w:t>Users can see overall progress at a glance.</w:t>
+            </w:r>
+          </w:p>
+        </w:tc>
+      </w:tr>
+      <w:tr>
+        <w:tc>
+          <w:tcPr>
+            <w:tcW w:type="dxa" w:w="2556"/>
+          </w:tcPr>
+          <w:p>
+            <w:r>
+              <w:t>Done</w:t>
+            </w:r>
+          </w:p>
+        </w:tc>
+        <w:tc>
+          <w:tcPr>
+            <w:tcW w:type="dxa" w:w="2556"/>
+          </w:tcPr>
+          <w:p>
+            <w:r>
+              <w:t>Discussion plaza base flow and voice-post support</w:t>
+            </w:r>
+          </w:p>
+        </w:tc>
+        <w:tc>
+          <w:tcPr>
+            <w:tcW w:type="dxa" w:w="2556"/>
           </w:tcPr>
           <w:p>
             <w:r>
@@ -172,11 +1137,11 @@
         </w:tc>
         <w:tc>
           <w:tcPr>
-            <w:tcW w:type="dxa" w:w="3600"/>
+            <w:tcW w:type="dxa" w:w="2556"/>
           </w:tcPr>
           <w:p>
             <w:r>
-              <w:t>Useful for long-term stability but not required for core Sprint 2 delivery.</w:t>
+              <w:t>Main discussion area is already usable.</w:t>
             </w:r>
           </w:p>
         </w:tc>
@@ -184,27 +1149,237 @@
       <w:tr>
         <w:tc>
           <w:tcPr>
-            <w:tcW w:type="dxa" w:w="3600"/>
+            <w:tcW w:type="dxa" w:w="2556"/>
           </w:tcPr>
           <w:p>
             <w:r>
-              <w:t>Backlog</w:t>
+              <w:t>Done</w:t>
             </w:r>
           </w:p>
         </w:tc>
         <w:tc>
           <w:tcPr>
-            <w:tcW w:type="dxa" w:w="3600"/>
+            <w:tcW w:type="dxa" w:w="2556"/>
           </w:tcPr>
           <w:p>
             <w:r>
-              <w:t>Schedule reminder and notification logic</w:t>
+              <w:t>TED listening library redesign and detail workflow</w:t>
             </w:r>
           </w:p>
         </w:tc>
         <w:tc>
           <w:tcPr>
-            <w:tcW w:type="dxa" w:w="3600"/>
+            <w:tcW w:type="dxa" w:w="2556"/>
+          </w:tcPr>
+          <w:p>
+            <w:r>
+              <w:t>Listening</w:t>
+            </w:r>
+          </w:p>
+        </w:tc>
+        <w:tc>
+          <w:tcPr>
+            <w:tcW w:type="dxa" w:w="2556"/>
+          </w:tcPr>
+          <w:p>
+            <w:r>
+              <w:t>Content browsing is more structured and practical.</w:t>
+            </w:r>
+          </w:p>
+        </w:tc>
+      </w:tr>
+      <w:tr>
+        <w:tc>
+          <w:tcPr>
+            <w:tcW w:type="dxa" w:w="2556"/>
+          </w:tcPr>
+          <w:p>
+            <w:r>
+              <w:t>Done</w:t>
+            </w:r>
+          </w:p>
+        </w:tc>
+        <w:tc>
+          <w:tcPr>
+            <w:tcW w:type="dxa" w:w="2556"/>
+          </w:tcPr>
+          <w:p>
+            <w:r>
+              <w:t>Listening AI feedback, practice mode, and TED filtering improvements</w:t>
+            </w:r>
+          </w:p>
+        </w:tc>
+        <w:tc>
+          <w:tcPr>
+            <w:tcW w:type="dxa" w:w="2556"/>
+          </w:tcPr>
+          <w:p>
+            <w:r>
+              <w:t>Listening</w:t>
+            </w:r>
+          </w:p>
+        </w:tc>
+        <w:tc>
+          <w:tcPr>
+            <w:tcW w:type="dxa" w:w="2556"/>
+          </w:tcPr>
+          <w:p>
+            <w:r>
+              <w:t>Core listening practice is much stronger now.</w:t>
+            </w:r>
+          </w:p>
+        </w:tc>
+      </w:tr>
+      <w:tr>
+        <w:tc>
+          <w:tcPr>
+            <w:tcW w:type="dxa" w:w="2556"/>
+          </w:tcPr>
+          <w:p>
+            <w:r>
+              <w:t>Done</w:t>
+            </w:r>
+          </w:p>
+        </w:tc>
+        <w:tc>
+          <w:tcPr>
+            <w:tcW w:type="dxa" w:w="2556"/>
+          </w:tcPr>
+          <w:p>
+            <w:r>
+              <w:t>Speaking workflow upgrade and AI-assisted feedback path</w:t>
+            </w:r>
+          </w:p>
+        </w:tc>
+        <w:tc>
+          <w:tcPr>
+            <w:tcW w:type="dxa" w:w="2556"/>
+          </w:tcPr>
+          <w:p>
+            <w:r>
+              <w:t>Speaking</w:t>
+            </w:r>
+          </w:p>
+        </w:tc>
+        <w:tc>
+          <w:tcPr>
+            <w:tcW w:type="dxa" w:w="2556"/>
+          </w:tcPr>
+          <w:p>
+            <w:r>
+              <w:t>Speaking practice path is more complete.</w:t>
+            </w:r>
+          </w:p>
+        </w:tc>
+      </w:tr>
+      <w:tr>
+        <w:tc>
+          <w:tcPr>
+            <w:tcW w:type="dxa" w:w="2556"/>
+          </w:tcPr>
+          <w:p>
+            <w:r>
+              <w:t>Done</w:t>
+            </w:r>
+          </w:p>
+        </w:tc>
+        <w:tc>
+          <w:tcPr>
+            <w:tcW w:type="dxa" w:w="2556"/>
+          </w:tcPr>
+          <w:p>
+            <w:r>
+              <w:t>Reading and writing core completion pages</w:t>
+            </w:r>
+          </w:p>
+        </w:tc>
+        <w:tc>
+          <w:tcPr>
+            <w:tcW w:type="dxa" w:w="2556"/>
+          </w:tcPr>
+          <w:p>
+            <w:r>
+              <w:t>Reading / writing</w:t>
+            </w:r>
+          </w:p>
+        </w:tc>
+        <w:tc>
+          <w:tcPr>
+            <w:tcW w:type="dxa" w:w="2556"/>
+          </w:tcPr>
+          <w:p>
+            <w:r>
+              <w:t>Main academic practice flow is already in place.</w:t>
+            </w:r>
+          </w:p>
+        </w:tc>
+      </w:tr>
+      <w:tr>
+        <w:tc>
+          <w:tcPr>
+            <w:tcW w:type="dxa" w:w="2556"/>
+          </w:tcPr>
+          <w:p>
+            <w:r>
+              <w:t>Done</w:t>
+            </w:r>
+          </w:p>
+        </w:tc>
+        <w:tc>
+          <w:tcPr>
+            <w:tcW w:type="dxa" w:w="2556"/>
+          </w:tcPr>
+          <w:p>
+            <w:r>
+              <w:t>Language switcher and key bilingual adaptation across core pages</w:t>
+            </w:r>
+          </w:p>
+        </w:tc>
+        <w:tc>
+          <w:tcPr>
+            <w:tcW w:type="dxa" w:w="2556"/>
+          </w:tcPr>
+          <w:p>
+            <w:r>
+              <w:t>Shared UX</w:t>
+            </w:r>
+          </w:p>
+        </w:tc>
+        <w:tc>
+          <w:tcPr>
+            <w:tcW w:type="dxa" w:w="2556"/>
+          </w:tcPr>
+          <w:p>
+            <w:r>
+              <w:t>Core pages can switch between Chinese and English.</w:t>
+            </w:r>
+          </w:p>
+        </w:tc>
+      </w:tr>
+      <w:tr>
+        <w:tc>
+          <w:tcPr>
+            <w:tcW w:type="dxa" w:w="2556"/>
+          </w:tcPr>
+          <w:p>
+            <w:r>
+              <w:t>Done</w:t>
+            </w:r>
+          </w:p>
+        </w:tc>
+        <w:tc>
+          <w:tcPr>
+            <w:tcW w:type="dxa" w:w="2556"/>
+          </w:tcPr>
+          <w:p>
+            <w:r>
+              <w:t>Schedule timetable grid, compact layout, and inline editing</w:t>
+            </w:r>
+          </w:p>
+        </w:tc>
+        <w:tc>
+          <w:tcPr>
+            <w:tcW w:type="dxa" w:w="2556"/>
           </w:tcPr>
           <w:p>
             <w:r>
@@ -214,11 +1389,11 @@
         </w:tc>
         <w:tc>
           <w:tcPr>
-            <w:tcW w:type="dxa" w:w="3600"/>
+            <w:tcW w:type="dxa" w:w="2556"/>
           </w:tcPr>
           <w:p>
             <w:r>
-              <w:t>Delay until timetable, deadline, and auto-plan logic are stable.</w:t>
+              <w:t>The planning page is now much closer to a realistic student timetable setup.</w:t>
             </w:r>
           </w:p>
         </w:tc>
@@ -226,111 +1401,27 @@
       <w:tr>
         <w:tc>
           <w:tcPr>
-            <w:tcW w:type="dxa" w:w="3600"/>
+            <w:tcW w:type="dxa" w:w="2556"/>
           </w:tcPr>
           <w:p>
             <w:r>
-              <w:t>Backlog</w:t>
+              <w:t>Done</w:t>
             </w:r>
           </w:p>
         </w:tc>
         <w:tc>
           <w:tcPr>
-            <w:tcW w:type="dxa" w:w="3600"/>
+            <w:tcW w:type="dxa" w:w="2556"/>
           </w:tcPr>
           <w:p>
             <w:r>
-              <w:t>Admin content upload tools</w:t>
+              <w:t>Timetable import from Excel and timetable screenshot recognition</w:t>
             </w:r>
           </w:p>
         </w:tc>
         <w:tc>
           <w:tcPr>
-            <w:tcW w:type="dxa" w:w="3600"/>
-          </w:tcPr>
-          <w:p>
-            <w:r>
-              <w:t>Content operations</w:t>
-            </w:r>
-          </w:p>
-        </w:tc>
-        <w:tc>
-          <w:tcPr>
-            <w:tcW w:type="dxa" w:w="3600"/>
-          </w:tcPr>
-          <w:p>
-            <w:r>
-              <w:t>Can support long-term TED / reading maintenance later.</w:t>
-            </w:r>
-          </w:p>
-        </w:tc>
-      </w:tr>
-      <w:tr>
-        <w:tc>
-          <w:tcPr>
-            <w:tcW w:type="dxa" w:w="3600"/>
-          </w:tcPr>
-          <w:p>
-            <w:r>
-              <w:t>Backlog</w:t>
-            </w:r>
-          </w:p>
-        </w:tc>
-        <w:tc>
-          <w:tcPr>
-            <w:tcW w:type="dxa" w:w="3600"/>
-          </w:tcPr>
-          <w:p>
-            <w:r>
-              <w:t>Learning analytics panel expansion</w:t>
-            </w:r>
-          </w:p>
-        </w:tc>
-        <w:tc>
-          <w:tcPr>
-            <w:tcW w:type="dxa" w:w="3600"/>
-          </w:tcPr>
-          <w:p>
-            <w:r>
-              <w:t>Dashboard / progress</w:t>
-            </w:r>
-          </w:p>
-        </w:tc>
-        <w:tc>
-          <w:tcPr>
-            <w:tcW w:type="dxa" w:w="3600"/>
-          </w:tcPr>
-          <w:p>
-            <w:r>
-              <w:t>Valuable but secondary to current sprint must-haves.</w:t>
-            </w:r>
-          </w:p>
-        </w:tc>
-      </w:tr>
-      <w:tr>
-        <w:tc>
-          <w:tcPr>
-            <w:tcW w:type="dxa" w:w="3600"/>
-          </w:tcPr>
-          <w:p>
-            <w:r>
-              <w:t>Backlog</w:t>
-            </w:r>
-          </w:p>
-        </w:tc>
-        <w:tc>
-          <w:tcPr>
-            <w:tcW w:type="dxa" w:w="3600"/>
-          </w:tcPr>
-          <w:p>
-            <w:r>
-              <w:t>Calendar export / external sync</w:t>
-            </w:r>
-          </w:p>
-        </w:tc>
-        <w:tc>
-          <w:tcPr>
-            <w:tcW w:type="dxa" w:w="3600"/>
+            <w:tcW w:type="dxa" w:w="2556"/>
           </w:tcPr>
           <w:p>
             <w:r>
@@ -340,11 +1431,11 @@
         </w:tc>
         <w:tc>
           <w:tcPr>
-            <w:tcW w:type="dxa" w:w="3600"/>
+            <w:tcW w:type="dxa" w:w="2556"/>
           </w:tcPr>
           <w:p>
             <w:r>
-              <w:t>Not required for current sprint closure.</w:t>
+              <w:t>Setup friction was reduced significantly for the planning flow.</w:t>
             </w:r>
           </w:p>
         </w:tc>
@@ -352,321 +1443,27 @@
       <w:tr>
         <w:tc>
           <w:tcPr>
-            <w:tcW w:type="dxa" w:w="3600"/>
+            <w:tcW w:type="dxa" w:w="2556"/>
           </w:tcPr>
           <w:p>
             <w:r>
-              <w:t>To Do</w:t>
+              <w:t>Done</w:t>
             </w:r>
           </w:p>
         </w:tc>
         <w:tc>
           <w:tcPr>
-            <w:tcW w:type="dxa" w:w="3600"/>
+            <w:tcW w:type="dxa" w:w="2556"/>
           </w:tcPr>
           <w:p>
             <w:r>
-              <w:t>Review Center direct navigation entry</w:t>
+              <w:t>Smart Builder flow: generate preview, apply to week, and manual edits</w:t>
             </w:r>
           </w:p>
         </w:tc>
         <w:tc>
           <w:tcPr>
-            <w:tcW w:type="dxa" w:w="3600"/>
-          </w:tcPr>
-          <w:p>
-            <w:r>
-              <w:t>Review / navigation</w:t>
-            </w:r>
-          </w:p>
-        </w:tc>
-        <w:tc>
-          <w:tcPr>
-            <w:tcW w:type="dxa" w:w="3600"/>
-          </w:tcPr>
-          <w:p>
-            <w:r>
-              <w:t>Improve discoverability after core schedule and review flow are stable.</w:t>
-            </w:r>
-          </w:p>
-        </w:tc>
-      </w:tr>
-      <w:tr>
-        <w:tc>
-          <w:tcPr>
-            <w:tcW w:type="dxa" w:w="3600"/>
-          </w:tcPr>
-          <w:p>
-            <w:r>
-              <w:t>To Do</w:t>
-            </w:r>
-          </w:p>
-        </w:tc>
-        <w:tc>
-          <w:tcPr>
-            <w:tcW w:type="dxa" w:w="3600"/>
-          </w:tcPr>
-          <w:p>
-            <w:r>
-              <w:t>Forum reply threading polish</w:t>
-            </w:r>
-          </w:p>
-        </w:tc>
-        <w:tc>
-          <w:tcPr>
-            <w:tcW w:type="dxa" w:w="3600"/>
-          </w:tcPr>
-          <w:p>
-            <w:r>
-              <w:t>Forum</w:t>
-            </w:r>
-          </w:p>
-        </w:tc>
-        <w:tc>
-          <w:tcPr>
-            <w:tcW w:type="dxa" w:w="3600"/>
-          </w:tcPr>
-          <w:p>
-            <w:r>
-              <w:t>Needed for cleaner discussion depth after core posting flow is secured.</w:t>
-            </w:r>
-          </w:p>
-        </w:tc>
-      </w:tr>
-      <w:tr>
-        <w:tc>
-          <w:tcPr>
-            <w:tcW w:type="dxa" w:w="3600"/>
-          </w:tcPr>
-          <w:p>
-            <w:r>
-              <w:t>To Do</w:t>
-            </w:r>
-          </w:p>
-        </w:tc>
-        <w:tc>
-          <w:tcPr>
-            <w:tcW w:type="dxa" w:w="3600"/>
-          </w:tcPr>
-          <w:p>
-            <w:r>
-              <w:t>Writing draft save and formatting polish</w:t>
-            </w:r>
-          </w:p>
-        </w:tc>
-        <w:tc>
-          <w:tcPr>
-            <w:tcW w:type="dxa" w:w="3600"/>
-          </w:tcPr>
-          <w:p>
-            <w:r>
-              <w:t>Writing</w:t>
-            </w:r>
-          </w:p>
-        </w:tc>
-        <w:tc>
-          <w:tcPr>
-            <w:tcW w:type="dxa" w:w="3600"/>
-          </w:tcPr>
-          <w:p>
-            <w:r>
-              <w:t>Important usability improvement after base writing flow.</w:t>
-            </w:r>
-          </w:p>
-        </w:tc>
-      </w:tr>
-      <w:tr>
-        <w:tc>
-          <w:tcPr>
-            <w:tcW w:type="dxa" w:w="3600"/>
-          </w:tcPr>
-          <w:p>
-            <w:r>
-              <w:t>To Do</w:t>
-            </w:r>
-          </w:p>
-        </w:tc>
-        <w:tc>
-          <w:tcPr>
-            <w:tcW w:type="dxa" w:w="3600"/>
-          </w:tcPr>
-          <w:p>
-            <w:r>
-              <w:t>Reading notes / bookmark polish</w:t>
-            </w:r>
-          </w:p>
-        </w:tc>
-        <w:tc>
-          <w:tcPr>
-            <w:tcW w:type="dxa" w:w="3600"/>
-          </w:tcPr>
-          <w:p>
-            <w:r>
-              <w:t>Reading</w:t>
-            </w:r>
-          </w:p>
-        </w:tc>
-        <w:tc>
-          <w:tcPr>
-            <w:tcW w:type="dxa" w:w="3600"/>
-          </w:tcPr>
-          <w:p>
-            <w:r>
-              <w:t>Should improve practical study use after answer verification is stable.</w:t>
-            </w:r>
-          </w:p>
-        </w:tc>
-      </w:tr>
-      <w:tr>
-        <w:tc>
-          <w:tcPr>
-            <w:tcW w:type="dxa" w:w="3600"/>
-          </w:tcPr>
-          <w:p>
-            <w:r>
-              <w:t>To Do</w:t>
-            </w:r>
-          </w:p>
-        </w:tc>
-        <w:tc>
-          <w:tcPr>
-            <w:tcW w:type="dxa" w:w="3600"/>
-          </w:tcPr>
-          <w:p>
-            <w:r>
-              <w:t>Bilingual copy cleanup for schedule / dashboard / forum</w:t>
-            </w:r>
-          </w:p>
-        </w:tc>
-        <w:tc>
-          <w:tcPr>
-            <w:tcW w:type="dxa" w:w="3600"/>
-          </w:tcPr>
-          <w:p>
-            <w:r>
-              <w:t>Shared UX</w:t>
-            </w:r>
-          </w:p>
-        </w:tc>
-        <w:tc>
-          <w:tcPr>
-            <w:tcW w:type="dxa" w:w="3600"/>
-          </w:tcPr>
-          <w:p>
-            <w:r>
-              <w:t>Keep wording clearer once layout work settles.</w:t>
-            </w:r>
-          </w:p>
-        </w:tc>
-      </w:tr>
-      <w:tr>
-        <w:tc>
-          <w:tcPr>
-            <w:tcW w:type="dxa" w:w="3600"/>
-          </w:tcPr>
-          <w:p>
-            <w:r>
-              <w:t>To Do</w:t>
-            </w:r>
-          </w:p>
-        </w:tc>
-        <w:tc>
-          <w:tcPr>
-            <w:tcW w:type="dxa" w:w="3600"/>
-          </w:tcPr>
-          <w:p>
-            <w:r>
-              <w:t>Dashboard and schedule connection points</w:t>
-            </w:r>
-          </w:p>
-        </w:tc>
-        <w:tc>
-          <w:tcPr>
-            <w:tcW w:type="dxa" w:w="3600"/>
-          </w:tcPr>
-          <w:p>
-            <w:r>
-              <w:t>Dashboard / schedule</w:t>
-            </w:r>
-          </w:p>
-        </w:tc>
-        <w:tc>
-          <w:tcPr>
-            <w:tcW w:type="dxa" w:w="3600"/>
-          </w:tcPr>
-          <w:p>
-            <w:r>
-              <w:t>Expose planning and progress together more clearly.</w:t>
-            </w:r>
-          </w:p>
-        </w:tc>
-      </w:tr>
-      <w:tr>
-        <w:tc>
-          <w:tcPr>
-            <w:tcW w:type="dxa" w:w="3600"/>
-          </w:tcPr>
-          <w:p>
-            <w:r>
-              <w:t>To Do</w:t>
-            </w:r>
-          </w:p>
-        </w:tc>
-        <w:tc>
-          <w:tcPr>
-            <w:tcW w:type="dxa" w:w="3600"/>
-          </w:tcPr>
-          <w:p>
-            <w:r>
-              <w:t>Discussion empty states and guidance text</w:t>
-            </w:r>
-          </w:p>
-        </w:tc>
-        <w:tc>
-          <w:tcPr>
-            <w:tcW w:type="dxa" w:w="3600"/>
-          </w:tcPr>
-          <w:p>
-            <w:r>
-              <w:t>Forum</w:t>
-            </w:r>
-          </w:p>
-        </w:tc>
-        <w:tc>
-          <w:tcPr>
-            <w:tcW w:type="dxa" w:w="3600"/>
-          </w:tcPr>
-          <w:p>
-            <w:r>
-              <w:t>Helpful for clarity but not above core interaction stability.</w:t>
-            </w:r>
-          </w:p>
-        </w:tc>
-      </w:tr>
-      <w:tr>
-        <w:tc>
-          <w:tcPr>
-            <w:tcW w:type="dxa" w:w="3600"/>
-          </w:tcPr>
-          <w:p>
-            <w:r>
-              <w:t>In Progress</w:t>
-            </w:r>
-          </w:p>
-        </w:tc>
-        <w:tc>
-          <w:tcPr>
-            <w:tcW w:type="dxa" w:w="3600"/>
-          </w:tcPr>
-          <w:p>
-            <w:r>
-              <w:t>Schedule timetable grid and manual editing flow</w:t>
-            </w:r>
-          </w:p>
-        </w:tc>
-        <w:tc>
-          <w:tcPr>
-            <w:tcW w:type="dxa" w:w="3600"/>
+            <w:tcW w:type="dxa" w:w="2556"/>
           </w:tcPr>
           <w:p>
             <w:r>
@@ -676,11 +1473,11 @@
         </w:tc>
         <w:tc>
           <w:tcPr>
-            <w:tcW w:type="dxa" w:w="3600"/>
+            <w:tcW w:type="dxa" w:w="2556"/>
           </w:tcPr>
           <w:p>
             <w:r>
-              <w:t>Driving the module toward a more realistic student timetable setup.</w:t>
+              <w:t>The weekly plan is no longer forced; students can review before applying.</w:t>
             </w:r>
           </w:p>
         </w:tc>
@@ -688,27 +1485,27 @@
       <w:tr>
         <w:tc>
           <w:tcPr>
-            <w:tcW w:type="dxa" w:w="3600"/>
+            <w:tcW w:type="dxa" w:w="2556"/>
           </w:tcPr>
           <w:p>
             <w:r>
-              <w:t>In Progress</w:t>
+              <w:t>Done</w:t>
             </w:r>
           </w:p>
         </w:tc>
         <w:tc>
           <w:tcPr>
-            <w:tcW w:type="dxa" w:w="3600"/>
+            <w:tcW w:type="dxa" w:w="2556"/>
           </w:tcPr>
           <w:p>
             <w:r>
-              <w:t>Schedule auto weekly plan refinement</w:t>
+              <w:t>Weekly timing logic tied to class periods and after-class study time</w:t>
             </w:r>
           </w:p>
         </w:tc>
         <w:tc>
           <w:tcPr>
-            <w:tcW w:type="dxa" w:w="3600"/>
+            <w:tcW w:type="dxa" w:w="2556"/>
           </w:tcPr>
           <w:p>
             <w:r>
@@ -718,11 +1515,11 @@
         </w:tc>
         <w:tc>
           <w:tcPr>
-            <w:tcW w:type="dxa" w:w="3600"/>
+            <w:tcW w:type="dxa" w:w="2556"/>
           </w:tcPr>
           <w:p>
             <w:r>
-              <w:t>Keep the plan tied to classes, deadlines, and daily learning flow.</w:t>
+              <w:t>Planning now follows timetable rhythm rather than fixed clock times.</w:t>
             </w:r>
           </w:p>
         </w:tc>
@@ -730,41 +1527,41 @@
       <w:tr>
         <w:tc>
           <w:tcPr>
-            <w:tcW w:type="dxa" w:w="3600"/>
+            <w:tcW w:type="dxa" w:w="2556"/>
           </w:tcPr>
           <w:p>
             <w:r>
-              <w:t>In Progress</w:t>
+              <w:t>Done</w:t>
             </w:r>
           </w:p>
         </w:tc>
         <w:tc>
           <w:tcPr>
-            <w:tcW w:type="dxa" w:w="3600"/>
+            <w:tcW w:type="dxa" w:w="2556"/>
           </w:tcPr>
           <w:p>
             <w:r>
-              <w:t>Timetable import from image and Excel</w:t>
+              <w:t>Homepage weekly-arrangement jump into the schedule page</w:t>
             </w:r>
           </w:p>
         </w:tc>
         <w:tc>
           <w:tcPr>
-            <w:tcW w:type="dxa" w:w="3600"/>
+            <w:tcW w:type="dxa" w:w="2556"/>
           </w:tcPr>
           <w:p>
             <w:r>
-              <w:t>Schedule</w:t>
+              <w:t>Home / schedule</w:t>
             </w:r>
           </w:p>
         </w:tc>
         <w:tc>
           <w:tcPr>
-            <w:tcW w:type="dxa" w:w="3600"/>
+            <w:tcW w:type="dxa" w:w="2556"/>
           </w:tcPr>
           <w:p>
             <w:r>
-              <w:t>Accelerates setup and increases practical value for users.</w:t>
+              <w:t>Users can move directly from the home summary to the matching weekly plan day.</w:t>
             </w:r>
           </w:p>
         </w:tc>
@@ -772,41 +1569,41 @@
       <w:tr>
         <w:tc>
           <w:tcPr>
-            <w:tcW w:type="dxa" w:w="3600"/>
+            <w:tcW w:type="dxa" w:w="2556"/>
           </w:tcPr>
           <w:p>
             <w:r>
-              <w:t>In Progress</w:t>
+              <w:t>Done</w:t>
             </w:r>
           </w:p>
         </w:tc>
         <w:tc>
           <w:tcPr>
-            <w:tcW w:type="dxa" w:w="3600"/>
+            <w:tcW w:type="dxa" w:w="2556"/>
           </w:tcPr>
           <w:p>
             <w:r>
-              <w:t>Forum beautification and voice posting stabilization</w:t>
+              <w:t>Context discussion docks added to Listening, Speaking, Reading, and Writing</w:t>
             </w:r>
           </w:p>
         </w:tc>
         <w:tc>
           <w:tcPr>
-            <w:tcW w:type="dxa" w:w="3600"/>
+            <w:tcW w:type="dxa" w:w="2556"/>
           </w:tcPr>
           <w:p>
             <w:r>
-              <w:t>Forum</w:t>
+              <w:t>Comments / modules</w:t>
             </w:r>
           </w:p>
         </w:tc>
         <w:tc>
           <w:tcPr>
-            <w:tcW w:type="dxa" w:w="3600"/>
+            <w:tcW w:type="dxa" w:w="2556"/>
           </w:tcPr>
           <w:p>
             <w:r>
-              <w:t>Core discussion experience is actively being strengthened.</w:t>
+              <w:t>All four core modules now support contextual discussion entry points.</w:t>
             </w:r>
           </w:p>
         </w:tc>
@@ -814,237 +1611,27 @@
       <w:tr>
         <w:tc>
           <w:tcPr>
-            <w:tcW w:type="dxa" w:w="3600"/>
+            <w:tcW w:type="dxa" w:w="2556"/>
           </w:tcPr>
           <w:p>
             <w:r>
-              <w:t>In Progress</w:t>
+              <w:t>Done</w:t>
             </w:r>
           </w:p>
         </w:tc>
         <w:tc>
           <w:tcPr>
-            <w:tcW w:type="dxa" w:w="3600"/>
+            <w:tcW w:type="dxa" w:w="2556"/>
           </w:tcPr>
           <w:p>
             <w:r>
-              <w:t>Reading answer verification and progress tracking</w:t>
+              <w:t>Database schema and API path added for schedule planning and module comments</w:t>
             </w:r>
           </w:p>
         </w:tc>
         <w:tc>
           <w:tcPr>
-            <w:tcW w:type="dxa" w:w="3600"/>
-          </w:tcPr>
-          <w:p>
-            <w:r>
-              <w:t>Reading</w:t>
-            </w:r>
-          </w:p>
-        </w:tc>
-        <w:tc>
-          <w:tcPr>
-            <w:tcW w:type="dxa" w:w="3600"/>
-          </w:tcPr>
-          <w:p>
-            <w:r>
-              <w:t>Important to move Reading from page display to usable practice flow.</w:t>
-            </w:r>
-          </w:p>
-        </w:tc>
-      </w:tr>
-      <w:tr>
-        <w:tc>
-          <w:tcPr>
-            <w:tcW w:type="dxa" w:w="3600"/>
-          </w:tcPr>
-          <w:p>
-            <w:r>
-              <w:t>In Progress</w:t>
-            </w:r>
-          </w:p>
-        </w:tc>
-        <w:tc>
-          <w:tcPr>
-            <w:tcW w:type="dxa" w:w="3600"/>
-          </w:tcPr>
-          <w:p>
-            <w:r>
-              <w:t>Writing page UI refinement and submission flow</w:t>
-            </w:r>
-          </w:p>
-        </w:tc>
-        <w:tc>
-          <w:tcPr>
-            <w:tcW w:type="dxa" w:w="3600"/>
-          </w:tcPr>
-          <w:p>
-            <w:r>
-              <w:t>Writing</w:t>
-            </w:r>
-          </w:p>
-        </w:tc>
-        <w:tc>
-          <w:tcPr>
-            <w:tcW w:type="dxa" w:w="3600"/>
-          </w:tcPr>
-          <w:p>
-            <w:r>
-              <w:t>Keeps writing aligned with the product design direction and usability needs.</w:t>
-            </w:r>
-          </w:p>
-        </w:tc>
-      </w:tr>
-      <w:tr>
-        <w:tc>
-          <w:tcPr>
-            <w:tcW w:type="dxa" w:w="3600"/>
-          </w:tcPr>
-          <w:p>
-            <w:r>
-              <w:t>In Progress</w:t>
-            </w:r>
-          </w:p>
-        </w:tc>
-        <w:tc>
-          <w:tcPr>
-            <w:tcW w:type="dxa" w:w="3600"/>
-          </w:tcPr>
-          <w:p>
-            <w:r>
-              <w:t>Speaking AI docking and scoring debugging</w:t>
-            </w:r>
-          </w:p>
-        </w:tc>
-        <w:tc>
-          <w:tcPr>
-            <w:tcW w:type="dxa" w:w="3600"/>
-          </w:tcPr>
-          <w:p>
-            <w:r>
-              <w:t>Speaking AI</w:t>
-            </w:r>
-          </w:p>
-        </w:tc>
-        <w:tc>
-          <w:tcPr>
-            <w:tcW w:type="dxa" w:w="3600"/>
-          </w:tcPr>
-          <w:p>
-            <w:r>
-              <w:t>Key sprint item because feedback quality shapes product value directly.</w:t>
-            </w:r>
-          </w:p>
-        </w:tc>
-      </w:tr>
-      <w:tr>
-        <w:tc>
-          <w:tcPr>
-            <w:tcW w:type="dxa" w:w="3600"/>
-          </w:tcPr>
-          <w:p>
-            <w:r>
-              <w:t>In Progress</w:t>
-            </w:r>
-          </w:p>
-        </w:tc>
-        <w:tc>
-          <w:tcPr>
-            <w:tcW w:type="dxa" w:w="3600"/>
-          </w:tcPr>
-          <w:p>
-            <w:r>
-              <w:t>Speaking material adaptation and import cleanup</w:t>
-            </w:r>
-          </w:p>
-        </w:tc>
-        <w:tc>
-          <w:tcPr>
-            <w:tcW w:type="dxa" w:w="3600"/>
-          </w:tcPr>
-          <w:p>
-            <w:r>
-              <w:t>Speaking</w:t>
-            </w:r>
-          </w:p>
-        </w:tc>
-        <w:tc>
-          <w:tcPr>
-            <w:tcW w:type="dxa" w:w="3600"/>
-          </w:tcPr>
-          <w:p>
-            <w:r>
-              <w:t>Needed so the page has relevant materials and clearer practice context.</w:t>
-            </w:r>
-          </w:p>
-        </w:tc>
-      </w:tr>
-      <w:tr>
-        <w:tc>
-          <w:tcPr>
-            <w:tcW w:type="dxa" w:w="3600"/>
-          </w:tcPr>
-          <w:p>
-            <w:r>
-              <w:t>In Progress</w:t>
-            </w:r>
-          </w:p>
-        </w:tc>
-        <w:tc>
-          <w:tcPr>
-            <w:tcW w:type="dxa" w:w="3600"/>
-          </w:tcPr>
-          <w:p>
-            <w:r>
-              <w:t>TED interdisciplinary resource curation and integration prep</w:t>
-            </w:r>
-          </w:p>
-        </w:tc>
-        <w:tc>
-          <w:tcPr>
-            <w:tcW w:type="dxa" w:w="3600"/>
-          </w:tcPr>
-          <w:p>
-            <w:r>
-              <w:t>Listening TED</w:t>
-            </w:r>
-          </w:p>
-        </w:tc>
-        <w:tc>
-          <w:tcPr>
-            <w:tcW w:type="dxa" w:w="3600"/>
-          </w:tcPr>
-          <w:p>
-            <w:r>
-              <w:t>Supports the expanded academic listening direction in Sprint 2.</w:t>
-            </w:r>
-          </w:p>
-        </w:tc>
-      </w:tr>
-      <w:tr>
-        <w:tc>
-          <w:tcPr>
-            <w:tcW w:type="dxa" w:w="3600"/>
-          </w:tcPr>
-          <w:p>
-            <w:r>
-              <w:t>In Progress</w:t>
-            </w:r>
-          </w:p>
-        </w:tc>
-        <w:tc>
-          <w:tcPr>
-            <w:tcW w:type="dxa" w:w="3600"/>
-          </w:tcPr>
-          <w:p>
-            <w:r>
-              <w:t>Database backup design and API path review</w:t>
-            </w:r>
-          </w:p>
-        </w:tc>
-        <w:tc>
-          <w:tcPr>
-            <w:tcW w:type="dxa" w:w="3600"/>
+            <w:tcW w:type="dxa" w:w="2556"/>
           </w:tcPr>
           <w:p>
             <w:r>
@@ -1054,11 +1641,11 @@
         </w:tc>
         <w:tc>
           <w:tcPr>
-            <w:tcW w:type="dxa" w:w="3600"/>
+            <w:tcW w:type="dxa" w:w="2556"/>
           </w:tcPr>
           <w:p>
             <w:r>
-              <w:t>Protects the product from feature growth without data planning.</w:t>
+              <w:t>The project now has a concrete persistence path for these newer features.</w:t>
             </w:r>
           </w:p>
         </w:tc>
@@ -1066,217 +1653,7 @@
       <w:tr>
         <w:tc>
           <w:tcPr>
-            <w:tcW w:type="dxa" w:w="3600"/>
-          </w:tcPr>
-          <w:p>
-            <w:r>
-              <w:t>Review / Testing</w:t>
-            </w:r>
-          </w:p>
-        </w:tc>
-        <w:tc>
-          <w:tcPr>
-            <w:tcW w:type="dxa" w:w="3600"/>
-          </w:tcPr>
-          <w:p>
-            <w:r>
-              <w:t>Listening TED path QA</w:t>
-            </w:r>
-          </w:p>
-        </w:tc>
-        <w:tc>
-          <w:tcPr>
-            <w:tcW w:type="dxa" w:w="3600"/>
-          </w:tcPr>
-          <w:p>
-            <w:r>
-              <w:t>Listening</w:t>
-            </w:r>
-          </w:p>
-        </w:tc>
-        <w:tc>
-          <w:tcPr>
-            <w:tcW w:type="dxa" w:w="3600"/>
-          </w:tcPr>
-          <w:p>
-            <w:r>
-              <w:t>Check routing, content opening, and general usability.</w:t>
-            </w:r>
-          </w:p>
-        </w:tc>
-      </w:tr>
-      <w:tr>
-        <w:tc>
-          <w:tcPr>
-            <w:tcW w:type="dxa" w:w="3600"/>
-          </w:tcPr>
-          <w:p>
-            <w:r>
-              <w:t>Review / Testing</w:t>
-            </w:r>
-          </w:p>
-        </w:tc>
-        <w:tc>
-          <w:tcPr>
-            <w:tcW w:type="dxa" w:w="3600"/>
-          </w:tcPr>
-          <w:p>
-            <w:r>
-              <w:t>AI fallback and error handling check</w:t>
-            </w:r>
-          </w:p>
-        </w:tc>
-        <w:tc>
-          <w:tcPr>
-            <w:tcW w:type="dxa" w:w="3600"/>
-          </w:tcPr>
-          <w:p>
-            <w:r>
-              <w:t>Listening / speaking</w:t>
-            </w:r>
-          </w:p>
-        </w:tc>
-        <w:tc>
-          <w:tcPr>
-            <w:tcW w:type="dxa" w:w="3600"/>
-          </w:tcPr>
-          <w:p>
-            <w:r>
-              <w:t>Make sure the main flow remains usable when AI response is imperfect.</w:t>
-            </w:r>
-          </w:p>
-        </w:tc>
-      </w:tr>
-      <w:tr>
-        <w:tc>
-          <w:tcPr>
-            <w:tcW w:type="dxa" w:w="3600"/>
-          </w:tcPr>
-          <w:p>
-            <w:r>
-              <w:t>Review / Testing</w:t>
-            </w:r>
-          </w:p>
-        </w:tc>
-        <w:tc>
-          <w:tcPr>
-            <w:tcW w:type="dxa" w:w="3600"/>
-          </w:tcPr>
-          <w:p>
-            <w:r>
-              <w:t>Auth -&gt; learning module -&gt; dashboard smoke test</w:t>
-            </w:r>
-          </w:p>
-        </w:tc>
-        <w:tc>
-          <w:tcPr>
-            <w:tcW w:type="dxa" w:w="3600"/>
-          </w:tcPr>
-          <w:p>
-            <w:r>
-              <w:t>Cross-page</w:t>
-            </w:r>
-          </w:p>
-        </w:tc>
-        <w:tc>
-          <w:tcPr>
-            <w:tcW w:type="dxa" w:w="3600"/>
-          </w:tcPr>
-          <w:p>
-            <w:r>
-              <w:t>Protect end-to-end demo flow after multi-page changes.</w:t>
-            </w:r>
-          </w:p>
-        </w:tc>
-      </w:tr>
-      <w:tr>
-        <w:tc>
-          <w:tcPr>
-            <w:tcW w:type="dxa" w:w="3600"/>
-          </w:tcPr>
-          <w:p>
-            <w:r>
-              <w:t>Review / Testing</w:t>
-            </w:r>
-          </w:p>
-        </w:tc>
-        <w:tc>
-          <w:tcPr>
-            <w:tcW w:type="dxa" w:w="3600"/>
-          </w:tcPr>
-          <w:p>
-            <w:r>
-              <w:t>Responsive check for forum, writing, reading, schedule</w:t>
-            </w:r>
-          </w:p>
-        </w:tc>
-        <w:tc>
-          <w:tcPr>
-            <w:tcW w:type="dxa" w:w="3600"/>
-          </w:tcPr>
-          <w:p>
-            <w:r>
-              <w:t>Shared UI</w:t>
-            </w:r>
-          </w:p>
-        </w:tc>
-        <w:tc>
-          <w:tcPr>
-            <w:tcW w:type="dxa" w:w="3600"/>
-          </w:tcPr>
-          <w:p>
-            <w:r>
-              <w:t>Prevent layout regressions after page simplification and new modules.</w:t>
-            </w:r>
-          </w:p>
-        </w:tc>
-      </w:tr>
-      <w:tr>
-        <w:tc>
-          <w:tcPr>
-            <w:tcW w:type="dxa" w:w="3600"/>
-          </w:tcPr>
-          <w:p>
-            <w:r>
-              <w:t>Review / Testing</w:t>
-            </w:r>
-          </w:p>
-        </w:tc>
-        <w:tc>
-          <w:tcPr>
-            <w:tcW w:type="dxa" w:w="3600"/>
-          </w:tcPr>
-          <w:p>
-            <w:r>
-              <w:t>Schedule interaction regression test</w:t>
-            </w:r>
-          </w:p>
-        </w:tc>
-        <w:tc>
-          <w:tcPr>
-            <w:tcW w:type="dxa" w:w="3600"/>
-          </w:tcPr>
-          <w:p>
-            <w:r>
-              <w:t>Schedule</w:t>
-            </w:r>
-          </w:p>
-        </w:tc>
-        <w:tc>
-          <w:tcPr>
-            <w:tcW w:type="dxa" w:w="3600"/>
-          </w:tcPr>
-          <w:p>
-            <w:r>
-              <w:t>Verify timetable editing, import, and weekly plan behavior stay stable.</w:t>
-            </w:r>
-          </w:p>
-        </w:tc>
-      </w:tr>
-      <w:tr>
-        <w:tc>
-          <w:tcPr>
-            <w:tcW w:type="dxa" w:w="3600"/>
+            <w:tcW w:type="dxa" w:w="2556"/>
           </w:tcPr>
           <w:p>
             <w:r>
@@ -1286,31 +1663,31 @@
         </w:tc>
         <w:tc>
           <w:tcPr>
-            <w:tcW w:type="dxa" w:w="3600"/>
+            <w:tcW w:type="dxa" w:w="2556"/>
           </w:tcPr>
           <w:p>
             <w:r>
-              <w:t>Sprint 2 goals confirmed with clear must-have focus</w:t>
+              <w:t>Local-first plus database-sync flow for schedule and context comments</w:t>
             </w:r>
           </w:p>
         </w:tc>
         <w:tc>
           <w:tcPr>
-            <w:tcW w:type="dxa" w:w="3600"/>
+            <w:tcW w:type="dxa" w:w="2556"/>
           </w:tcPr>
           <w:p>
             <w:r>
-              <w:t>PO / SM</w:t>
+              <w:t>Schedule / comments</w:t>
             </w:r>
           </w:p>
         </w:tc>
         <w:tc>
           <w:tcPr>
-            <w:tcW w:type="dxa" w:w="3600"/>
+            <w:tcW w:type="dxa" w:w="2556"/>
           </w:tcPr>
           <w:p>
             <w:r>
-              <w:t>Scope foundation is in place for this sprint.</w:t>
+              <w:t>The product still works in demo mode while also supporting Supabase-backed storage.</w:t>
             </w:r>
           </w:p>
         </w:tc>
@@ -1318,7 +1695,7 @@
       <w:tr>
         <w:tc>
           <w:tcPr>
-            <w:tcW w:type="dxa" w:w="3600"/>
+            <w:tcW w:type="dxa" w:w="2556"/>
           </w:tcPr>
           <w:p>
             <w:r>
@@ -1328,185 +1705,17 @@
         </w:tc>
         <w:tc>
           <w:tcPr>
-            <w:tcW w:type="dxa" w:w="3600"/>
+            <w:tcW w:type="dxa" w:w="2556"/>
           </w:tcPr>
           <w:p>
             <w:r>
-              <w:t>Sprint 2 task allocation aligned across the team</w:t>
+              <w:t>Sprint 2 priority and scope refresh across planning, discussion, and data persistence</w:t>
             </w:r>
           </w:p>
         </w:tc>
         <w:tc>
           <w:tcPr>
-            <w:tcW w:type="dxa" w:w="3600"/>
-          </w:tcPr>
-          <w:p>
-            <w:r>
-              <w:t>PO / SM</w:t>
-            </w:r>
-          </w:p>
-        </w:tc>
-        <w:tc>
-          <w:tcPr>
-            <w:tcW w:type="dxa" w:w="3600"/>
-          </w:tcPr>
-          <w:p>
-            <w:r>
-              <w:t>Ownership is defined for forum, TED, reading, writing, speaking AI, and schedule-related work.</w:t>
-            </w:r>
-          </w:p>
-        </w:tc>
-      </w:tr>
-      <w:tr>
-        <w:tc>
-          <w:tcPr>
-            <w:tcW w:type="dxa" w:w="3600"/>
-          </w:tcPr>
-          <w:p>
-            <w:r>
-              <w:t>Done</w:t>
-            </w:r>
-          </w:p>
-        </w:tc>
-        <w:tc>
-          <w:tcPr>
-            <w:tcW w:type="dxa" w:w="3600"/>
-          </w:tcPr>
-          <w:p>
-            <w:r>
-              <w:t>Core page simplification across Listening / Speaking / Reading / Writing</w:t>
-            </w:r>
-          </w:p>
-        </w:tc>
-        <w:tc>
-          <w:tcPr>
-            <w:tcW w:type="dxa" w:w="3600"/>
-          </w:tcPr>
-          <w:p>
-            <w:r>
-              <w:t>Shared UI</w:t>
-            </w:r>
-          </w:p>
-        </w:tc>
-        <w:tc>
-          <w:tcPr>
-            <w:tcW w:type="dxa" w:w="3600"/>
-          </w:tcPr>
-          <w:p>
-            <w:r>
-              <w:t>Reduced clutter and improved the base product structure.</w:t>
-            </w:r>
-          </w:p>
-        </w:tc>
-      </w:tr>
-      <w:tr>
-        <w:tc>
-          <w:tcPr>
-            <w:tcW w:type="dxa" w:w="3600"/>
-          </w:tcPr>
-          <w:p>
-            <w:r>
-              <w:t>Done</w:t>
-            </w:r>
-          </w:p>
-        </w:tc>
-        <w:tc>
-          <w:tcPr>
-            <w:tcW w:type="dxa" w:w="3600"/>
-          </w:tcPr>
-          <w:p>
-            <w:r>
-              <w:t>Forum layout optimization baseline</w:t>
-            </w:r>
-          </w:p>
-        </w:tc>
-        <w:tc>
-          <w:tcPr>
-            <w:tcW w:type="dxa" w:w="3600"/>
-          </w:tcPr>
-          <w:p>
-            <w:r>
-              <w:t>Forum</w:t>
-            </w:r>
-          </w:p>
-        </w:tc>
-        <w:tc>
-          <w:tcPr>
-            <w:tcW w:type="dxa" w:w="3600"/>
-          </w:tcPr>
-          <w:p>
-            <w:r>
-              <w:t>Discussion experience has moved beyond the initial rough version.</w:t>
-            </w:r>
-          </w:p>
-        </w:tc>
-      </w:tr>
-      <w:tr>
-        <w:tc>
-          <w:tcPr>
-            <w:tcW w:type="dxa" w:w="3600"/>
-          </w:tcPr>
-          <w:p>
-            <w:r>
-              <w:t>Done</w:t>
-            </w:r>
-          </w:p>
-        </w:tc>
-        <w:tc>
-          <w:tcPr>
-            <w:tcW w:type="dxa" w:w="3600"/>
-          </w:tcPr>
-          <w:p>
-            <w:r>
-              <w:t>Voice posting basic function available in forum</w:t>
-            </w:r>
-          </w:p>
-        </w:tc>
-        <w:tc>
-          <w:tcPr>
-            <w:tcW w:type="dxa" w:w="3600"/>
-          </w:tcPr>
-          <w:p>
-            <w:r>
-              <w:t>Forum</w:t>
-            </w:r>
-          </w:p>
-        </w:tc>
-        <w:tc>
-          <w:tcPr>
-            <w:tcW w:type="dxa" w:w="3600"/>
-          </w:tcPr>
-          <w:p>
-            <w:r>
-              <w:t>Forum interaction scope has already expanded meaningfully this sprint.</w:t>
-            </w:r>
-          </w:p>
-        </w:tc>
-      </w:tr>
-      <w:tr>
-        <w:tc>
-          <w:tcPr>
-            <w:tcW w:type="dxa" w:w="3600"/>
-          </w:tcPr>
-          <w:p>
-            <w:r>
-              <w:t>Done</w:t>
-            </w:r>
-          </w:p>
-        </w:tc>
-        <w:tc>
-          <w:tcPr>
-            <w:tcW w:type="dxa" w:w="3600"/>
-          </w:tcPr>
-          <w:p>
-            <w:r>
-              <w:t>Sprint 2 priority order refreshed around discussion, AI, core learning flow, and database readiness</w:t>
-            </w:r>
-          </w:p>
-        </w:tc>
-        <w:tc>
-          <w:tcPr>
-            <w:tcW w:type="dxa" w:w="3600"/>
+            <w:tcW w:type="dxa" w:w="2556"/>
           </w:tcPr>
           <w:p>
             <w:r>
@@ -1516,32 +1725,33 @@
         </w:tc>
         <w:tc>
           <w:tcPr>
-            <w:tcW w:type="dxa" w:w="3600"/>
+            <w:tcW w:type="dxa" w:w="2556"/>
           </w:tcPr>
           <w:p>
             <w:r>
-              <w:t>Helps protect sprint focus as features continue growing.</w:t>
+              <w:t>Current delivery documents and board now match the actual sprint state more closely.</w:t>
             </w:r>
           </w:p>
         </w:tc>
       </w:tr>
     </w:tbl>
     <w:p>
-      <w:pPr>
-        <w:pStyle w:val="Heading1"/>
-      </w:pPr>
       <w:r>
+        <w:rPr>
+          <w:b/>
+          <w:sz w:val="24"/>
+        </w:rPr>
         <w:t>PO Note</w:t>
       </w:r>
     </w:p>
     <w:p>
       <w:r>
-        <w:t>The board intentionally keeps multiple items in In Progress because Sprint 2 currently involves parallel development across discussion, AI, learning modules, schedule, and database-related work. The main control point is not to let In Progress expand without acceptance progress on P0 items.</w:t>
+        <w:t>The current control point is to close Sprint 2 on integrated learning value: stable core practice pages, realistic schedule planning, useful discussion paths, and dependable data flow. Reminders, export, moderation, analytics, and admin tools should remain behind sprint-closure work.</w:t>
       </w:r>
     </w:p>
     <w:sectPr>
-      <w:pgSz w:w="15840" w:h="12240" w:orient="landscape"/>
-      <w:pgMar w:top="1440" w:right="720" w:bottom="1440" w:left="720" w:header="720" w:footer="720" w:gutter="0"/>
+      <w:pgSz w:w="12240" w:h="15840"/>
+      <w:pgMar w:top="1008" w:right="1008" w:bottom="1008" w:left="1008" w:header="720" w:footer="720" w:gutter="0"/>
       <w:cols w:space="720"/>
       <w:docGrid w:linePitch="360"/>
     </w:sectPr>
@@ -1914,7 +2124,7 @@
     <w:rsid w:val="00FC693F"/>
     <w:rPr>
       <w:rFonts w:ascii="Calibri" w:hAnsi="Calibri"/>
-      <w:sz w:val="22"/>
+      <w:sz w:val="21"/>
     </w:rPr>
   </w:style>
   <w:style w:type="paragraph" w:styleId="Header">
@@ -1976,7 +2186,7 @@
       <w:outlineLvl w:val="0"/>
     </w:pPr>
     <w:rPr>
-      <w:rFonts w:asciiTheme="majorHAnsi" w:eastAsiaTheme="majorEastAsia" w:hAnsiTheme="majorHAnsi" w:cstheme="majorBidi" w:ascii="Calibri" w:hAnsi="Calibri"/>
+      <w:rFonts w:asciiTheme="majorHAnsi" w:eastAsiaTheme="majorEastAsia" w:hAnsiTheme="majorHAnsi" w:cstheme="majorBidi"/>
       <w:b/>
       <w:bCs/>
       <w:color w:val="365F91" w:themeColor="accent1" w:themeShade="BF"/>
@@ -2000,7 +2210,7 @@
       <w:outlineLvl w:val="1"/>
     </w:pPr>
     <w:rPr>
-      <w:rFonts w:asciiTheme="majorHAnsi" w:eastAsiaTheme="majorEastAsia" w:hAnsiTheme="majorHAnsi" w:cstheme="majorBidi" w:ascii="Calibri" w:hAnsi="Calibri"/>
+      <w:rFonts w:asciiTheme="majorHAnsi" w:eastAsiaTheme="majorEastAsia" w:hAnsiTheme="majorHAnsi" w:cstheme="majorBidi"/>
       <w:b/>
       <w:bCs/>
       <w:color w:val="4F81BD" w:themeColor="accent1"/>
@@ -2024,7 +2234,7 @@
       <w:outlineLvl w:val="2"/>
     </w:pPr>
     <w:rPr>
-      <w:rFonts w:asciiTheme="majorHAnsi" w:eastAsiaTheme="majorEastAsia" w:hAnsiTheme="majorHAnsi" w:cstheme="majorBidi" w:ascii="Calibri" w:hAnsi="Calibri"/>
+      <w:rFonts w:asciiTheme="majorHAnsi" w:eastAsiaTheme="majorEastAsia" w:hAnsiTheme="majorHAnsi" w:cstheme="majorBidi"/>
       <w:b/>
       <w:bCs/>
       <w:color w:val="4F81BD" w:themeColor="accent1"/>
@@ -2265,7 +2475,7 @@
       <w:contextualSpacing/>
     </w:pPr>
     <w:rPr>
-      <w:rFonts w:asciiTheme="majorHAnsi" w:eastAsiaTheme="majorEastAsia" w:hAnsiTheme="majorHAnsi" w:cstheme="majorBidi" w:ascii="Calibri" w:hAnsi="Calibri"/>
+      <w:rFonts w:asciiTheme="majorHAnsi" w:eastAsiaTheme="majorEastAsia" w:hAnsiTheme="majorHAnsi" w:cstheme="majorBidi"/>
       <w:color w:val="17365D" w:themeColor="text2" w:themeShade="BF"/>
       <w:spacing w:val="5"/>
       <w:kern w:val="28"/>

</xml_diff>